<commit_message>
refactor: make build and VS Code toolchain config portable via env-aware detection
Centralize compiler and SFML path resolution in a shared PowerShell helper, update build/run scripts and VS Code config to use env vars and common install fallbacks instead of hardcoded machine paths, add inline comments explaining the portability approach, and document the local override variables in the README.
</commit_message>
<xml_diff>
--- a/docs/Group3_Phase1_Source_Code_Report_Template_Breakout.docx
+++ b/docs/Group3_Phase1_Source_Code_Report_Template_Breakout.docx
@@ -29,7 +29,7 @@
           <w:color w:val="1F4E78"/>
           <w:sz w:val="44"/>
         </w:rPr>
-        <w:t>Phase I Source Code Report Template</w:t>
+        <w:t>Phase I Source Code Report</w:t>
       </w:r>
       <w:r>
         <w:rPr>
@@ -169,7 +169,7 @@
           </w:tcPr>
           <w:p>
             <w:r>
-              <w:t>[Insert GitHub repository URL or branch name]</w:t>
+              <w:t>https://github.com/blaird96/BreakoutGame</w:t>
             </w:r>
           </w:p>
         </w:tc>
@@ -523,7 +523,7 @@
               <w:jc w:val="center"/>
             </w:pPr>
             <w:r>
-              <w:t>[Complete / In Progress]</w:t>
+              <w:t>[Complete]</w:t>
             </w:r>
           </w:p>
         </w:tc>
@@ -582,7 +582,7 @@
               <w:jc w:val="center"/>
             </w:pPr>
             <w:r>
-              <w:t>[Complete / In Progress]</w:t>
+              <w:t>[Complete]</w:t>
             </w:r>
           </w:p>
         </w:tc>
@@ -641,7 +641,7 @@
               <w:jc w:val="center"/>
             </w:pPr>
             <w:r>
-              <w:t>[Complete / In Progress]</w:t>
+              <w:t>[Complete]</w:t>
             </w:r>
           </w:p>
         </w:tc>
@@ -700,7 +700,7 @@
               <w:jc w:val="center"/>
             </w:pPr>
             <w:r>
-              <w:t>[Complete / In Progress]</w:t>
+              <w:t>[In Progress]</w:t>
             </w:r>
           </w:p>
         </w:tc>
@@ -1632,21 +1632,12 @@
         <w:br/>
         <w:t xml:space="preserve">  │   ├── </w:t>
       </w:r>
-      <w:proofErr w:type="spellStart"/>
       <w:r>
         <w:rPr>
           <w:rFonts w:ascii="Consolas" w:hAnsi="Consolas"/>
           <w:sz w:val="19"/>
         </w:rPr>
-        <w:t>GameManager.h</w:t>
-      </w:r>
-      <w:proofErr w:type="spellEnd"/>
-      <w:r>
-        <w:rPr>
-          <w:rFonts w:ascii="Consolas" w:hAnsi="Consolas"/>
-          <w:sz w:val="19"/>
-        </w:rPr>
-        <w:t xml:space="preserve"> </w:t>
+        <w:t xml:space="preserve">GameManager.h </w:t>
       </w:r>
       <w:r>
         <w:rPr>
@@ -1656,7 +1647,6 @@
         <w:br/>
         <w:t xml:space="preserve">  │   ├── </w:t>
       </w:r>
-      <w:proofErr w:type="spellStart"/>
       <w:r>
         <w:rPr>
           <w:rFonts w:ascii="Consolas" w:hAnsi="Consolas"/>
@@ -1678,7 +1668,6 @@
         </w:rPr>
         <w:t>Manager.h</w:t>
       </w:r>
-      <w:proofErr w:type="spellEnd"/>
       <w:r>
         <w:rPr>
           <w:rFonts w:ascii="Consolas" w:hAnsi="Consolas"/>
@@ -1701,34 +1690,16 @@
           <w:sz w:val="19"/>
         </w:rPr>
         <w:br/>
-        <w:t xml:space="preserve">  │   ├── Collision.cpp / </w:t>
+        <w:t xml:space="preserve">  │   ├── Collision.cpp / Collision.h</w:t>
       </w:r>
-      <w:proofErr w:type="spellStart"/>
-      <w:r>
-        <w:rPr>
-          <w:rFonts w:ascii="Consolas" w:hAnsi="Consolas"/>
-          <w:sz w:val="19"/>
-        </w:rPr>
-        <w:t>Collision.h</w:t>
-      </w:r>
-      <w:proofErr w:type="spellEnd"/>
       <w:r>
         <w:rPr>
           <w:rFonts w:ascii="Consolas" w:hAnsi="Consolas"/>
           <w:sz w:val="19"/>
         </w:rPr>
         <w:br/>
-        <w:t xml:space="preserve">  │   └── GameState.cpp / </w:t>
+        <w:t xml:space="preserve">  │   └── GameState.cpp / GameState.h</w:t>
       </w:r>
-      <w:proofErr w:type="spellStart"/>
-      <w:r>
-        <w:rPr>
-          <w:rFonts w:ascii="Consolas" w:hAnsi="Consolas"/>
-          <w:sz w:val="19"/>
-        </w:rPr>
-        <w:t>GameState.h</w:t>
-      </w:r>
-      <w:proofErr w:type="spellEnd"/>
       <w:r>
         <w:rPr>
           <w:rFonts w:ascii="Consolas" w:hAnsi="Consolas"/>
@@ -15177,6 +15148,29 @@
       </w:tcPr>
     </w:tblStylePr>
   </w:style>
+  <w:style w:type="character" w:styleId="Hyperlink">
+    <w:name w:val="Hyperlink"/>
+    <w:basedOn w:val="DefaultParagraphFont"/>
+    <w:uiPriority w:val="99"/>
+    <w:unhideWhenUsed/>
+    <w:rsid w:val="00A077F6"/>
+    <w:rPr>
+      <w:color w:val="0000FF" w:themeColor="hyperlink"/>
+      <w:u w:val="single"/>
+    </w:rPr>
+  </w:style>
+  <w:style w:type="character" w:styleId="UnresolvedMention">
+    <w:name w:val="Unresolved Mention"/>
+    <w:basedOn w:val="DefaultParagraphFont"/>
+    <w:uiPriority w:val="99"/>
+    <w:semiHidden/>
+    <w:unhideWhenUsed/>
+    <w:rsid w:val="00A077F6"/>
+    <w:rPr>
+      <w:color w:val="605E5C"/>
+      <w:shd w:val="clear" w:color="auto" w:fill="E1DFDD"/>
+    </w:rPr>
+  </w:style>
 </w:styles>
 </file>
 

</xml_diff>